<commit_message>
Added key idea 1
</commit_message>
<xml_diff>
--- a/ModelGuide/ModelGuide-LakeMeadWaterBank.docx
+++ b/ModelGuide/ModelGuide-LakeMeadWaterBank.docx
@@ -94,7 +94,10 @@
         <w:t>March 12</w:t>
       </w:r>
       <w:r>
-        <w:t>, 2025</w:t>
+        <w:t>, 202</w:t>
+      </w:r>
+      <w:r>
+        <w:t>6</w:t>
       </w:r>
     </w:p>
     <w:p/>
@@ -2465,6 +2468,7 @@
           </w:tcPr>
           <w:p>
             <w:r>
+              <w:lastRenderedPageBreak/>
               <w:t>Mexic</w:t>
             </w:r>
             <w:r>
@@ -4155,7 +4159,7 @@
           <w:noProof/>
         </w:rPr>
         <w:drawing>
-          <wp:anchor distT="0" distB="0" distL="114300" distR="114300" simplePos="0" relativeHeight="251673600" behindDoc="0" locked="0" layoutInCell="1" allowOverlap="1" wp14:anchorId="60025689" wp14:editId="39C8A6F7">
+          <wp:anchor distT="0" distB="0" distL="114300" distR="114300" simplePos="0" relativeHeight="251673600" behindDoc="0" locked="0" layoutInCell="1" allowOverlap="1" wp14:anchorId="60025689" wp14:editId="17A3EFBC">
             <wp:simplePos x="0" y="0"/>
             <wp:positionH relativeFrom="column">
               <wp:posOffset>913966</wp:posOffset>
@@ -4834,14 +4838,7 @@
           <w:b/>
           <w:bCs/>
         </w:rPr>
-        <w:t>Figure</w:t>
-      </w:r>
-      <w:r>
-        <w:rPr>
-          <w:b/>
-          <w:bCs/>
-        </w:rPr>
-        <w:t xml:space="preserve"> 2a. </w:t>
+        <w:t xml:space="preserve">Figure 2a. </w:t>
       </w:r>
       <w:r>
         <w:rPr>
@@ -7490,7 +7487,7 @@
           <w:noProof/>
         </w:rPr>
         <w:drawing>
-          <wp:anchor distT="0" distB="0" distL="114300" distR="114300" simplePos="0" relativeHeight="251670528" behindDoc="0" locked="0" layoutInCell="1" allowOverlap="1" wp14:anchorId="3751CB22" wp14:editId="67FBCE2A">
+          <wp:anchor distT="0" distB="0" distL="114300" distR="114300" simplePos="0" relativeHeight="251670528" behindDoc="0" locked="0" layoutInCell="1" allowOverlap="1" wp14:anchorId="3751CB22" wp14:editId="5AC0204C">
             <wp:simplePos x="0" y="0"/>
             <wp:positionH relativeFrom="column">
               <wp:posOffset>360613</wp:posOffset>
@@ -8510,7 +8507,7 @@
           <w:noProof/>
         </w:rPr>
         <w:drawing>
-          <wp:anchor distT="0" distB="0" distL="114300" distR="114300" simplePos="0" relativeHeight="251671552" behindDoc="0" locked="0" layoutInCell="1" allowOverlap="1" wp14:anchorId="1A5FC5AF" wp14:editId="26E6EF39">
+          <wp:anchor distT="0" distB="0" distL="114300" distR="114300" simplePos="0" relativeHeight="251671552" behindDoc="0" locked="0" layoutInCell="1" allowOverlap="1" wp14:anchorId="1A5FC5AF" wp14:editId="6FE5B791">
             <wp:simplePos x="0" y="0"/>
             <wp:positionH relativeFrom="column">
               <wp:posOffset>-317500</wp:posOffset>
@@ -9747,7 +9744,7 @@
                 <w:noProof/>
               </w:rPr>
               <w:drawing>
-                <wp:inline distT="0" distB="0" distL="0" distR="0" wp14:anchorId="5F738E96" wp14:editId="0DDD596A">
+                <wp:inline distT="0" distB="0" distL="0" distR="0" wp14:anchorId="5F738E96" wp14:editId="56FE2BDE">
                   <wp:extent cx="4716397" cy="902234"/>
                   <wp:effectExtent l="0" t="0" r="0" b="0"/>
                   <wp:docPr id="881595818" name="Picture 1"/>
@@ -10399,13 +10396,7 @@
         <w:t>(</w:t>
       </w:r>
       <w:r>
-        <w:t>202</w:t>
-      </w:r>
-      <w:r>
-        <w:t>6</w:t>
-      </w:r>
-      <w:r>
-        <w:t xml:space="preserve">). "Immersive Model for Lake Mead Based on the Principle of Divide Reservoir Inflow" </w:t>
+        <w:t xml:space="preserve">2026). "Immersive Model for Lake Mead Based on the Principle of Divide Reservoir Inflow" </w:t>
       </w:r>
     </w:p>
     <w:p>
@@ -10413,13 +10404,7 @@
         <w:spacing w:after="0" w:line="240" w:lineRule="auto"/>
       </w:pPr>
       <w:r>
-        <w:t>Utah State University, Logan,</w:t>
-      </w:r>
-      <w:r>
-        <w:t xml:space="preserve"> </w:t>
-      </w:r>
-      <w:r>
-        <w:t>UT. </w:t>
+        <w:t>Utah State University, Logan, UT. </w:t>
       </w:r>
     </w:p>
     <w:p>
@@ -15913,6 +15898,7 @@
   <w:style w:type="character" w:default="1" w:styleId="DefaultParagraphFont">
     <w:name w:val="Default Paragraph Font"/>
     <w:uiPriority w:val="1"/>
+    <w:semiHidden/>
     <w:unhideWhenUsed/>
   </w:style>
   <w:style w:type="table" w:default="1" w:styleId="TableNormal">

</xml_diff>

<commit_message>
Updated slides and model guide
</commit_message>
<xml_diff>
--- a/ModelGuide/ModelGuide-LakeMeadWaterBank.docx
+++ b/ModelGuide/ModelGuide-LakeMeadWaterBank.docx
@@ -361,6 +361,93 @@
       <w:r>
         <w:lastRenderedPageBreak/>
         <w:t>Key Model Ideas</w:t>
+      </w:r>
+    </w:p>
+    <w:p>
+      <w:pPr>
+        <w:pStyle w:val="ListParagraph"/>
+        <w:numPr>
+          <w:ilvl w:val="0"/>
+          <w:numId w:val="20"/>
+        </w:numPr>
+        <w:rPr>
+          <w:b/>
+          <w:bCs/>
+        </w:rPr>
+      </w:pPr>
+      <w:r>
+        <w:rPr>
+          <w:b/>
+          <w:bCs/>
+        </w:rPr>
+        <w:t>There is broad agreement that Colorado River</w:t>
+      </w:r>
+      <w:r>
+        <w:rPr>
+          <w:b/>
+          <w:bCs/>
+        </w:rPr>
+        <w:t xml:space="preserve"> </w:t>
+      </w:r>
+      <w:r>
+        <w:rPr>
+          <w:b/>
+          <w:bCs/>
+        </w:rPr>
+        <w:t>flows will be more volatile, declining, and have longer-lasting periods of low flow</w:t>
+      </w:r>
+      <w:r>
+        <w:rPr>
+          <w:b/>
+          <w:bCs/>
+        </w:rPr>
+        <w:t>.</w:t>
+      </w:r>
+      <w:r>
+        <w:rPr>
+          <w:noProof/>
+        </w:rPr>
+        <w:drawing>
+          <wp:inline distT="0" distB="0" distL="0" distR="0" wp14:anchorId="2BFFEBDB" wp14:editId="06AC7DDF">
+            <wp:extent cx="4739315" cy="2855741"/>
+            <wp:effectExtent l="0" t="0" r="0" b="1905"/>
+            <wp:docPr id="1468810505" name="Picture 1" descr="A graph of different colored lines&#10;&#10;AI-generated content may be incorrect."/>
+            <wp:cNvGraphicFramePr>
+              <a:graphicFrameLocks xmlns:a="http://schemas.openxmlformats.org/drawingml/2006/main" noChangeAspect="1"/>
+            </wp:cNvGraphicFramePr>
+            <a:graphic xmlns:a="http://schemas.openxmlformats.org/drawingml/2006/main">
+              <a:graphicData uri="http://schemas.openxmlformats.org/drawingml/2006/picture">
+                <pic:pic xmlns:pic="http://schemas.openxmlformats.org/drawingml/2006/picture">
+                  <pic:nvPicPr>
+                    <pic:cNvPr id="1468810505" name="Picture 1" descr="A graph of different colored lines&#10;&#10;AI-generated content may be incorrect."/>
+                    <pic:cNvPicPr/>
+                  </pic:nvPicPr>
+                  <pic:blipFill>
+                    <a:blip r:embed="rId10">
+                      <a:extLst>
+                        <a:ext uri="{28A0092B-C50C-407E-A947-70E740481C1C}">
+                          <a14:useLocalDpi xmlns:a14="http://schemas.microsoft.com/office/drawing/2010/main" val="0"/>
+                        </a:ext>
+                      </a:extLst>
+                    </a:blip>
+                    <a:stretch>
+                      <a:fillRect/>
+                    </a:stretch>
+                  </pic:blipFill>
+                  <pic:spPr>
+                    <a:xfrm>
+                      <a:off x="0" y="0"/>
+                      <a:ext cx="4906476" cy="2956466"/>
+                    </a:xfrm>
+                    <a:prstGeom prst="rect">
+                      <a:avLst/>
+                    </a:prstGeom>
+                  </pic:spPr>
+                </pic:pic>
+              </a:graphicData>
+            </a:graphic>
+          </wp:inline>
+        </w:drawing>
       </w:r>
     </w:p>
     <w:p>
@@ -407,7 +494,7 @@
                     <pic:cNvPicPr/>
                   </pic:nvPicPr>
                   <pic:blipFill>
-                    <a:blip r:embed="rId10"/>
+                    <a:blip r:embed="rId11"/>
                     <a:stretch>
                       <a:fillRect/>
                     </a:stretch>
@@ -440,6 +527,10 @@
           <w:ilvl w:val="0"/>
           <w:numId w:val="20"/>
         </w:numPr>
+        <w:rPr>
+          <w:b/>
+          <w:bCs/>
+        </w:rPr>
       </w:pPr>
       <w:r>
         <w:rPr>
@@ -473,7 +564,7 @@
                     <pic:cNvPicPr/>
                   </pic:nvPicPr>
                   <pic:blipFill>
-                    <a:blip r:embed="rId11"/>
+                    <a:blip r:embed="rId12"/>
                     <a:stretch>
                       <a:fillRect/>
                     </a:stretch>
@@ -496,61 +587,6 @@
     </w:p>
     <w:p>
       <w:pPr>
-        <w:jc w:val="center"/>
-      </w:pPr>
-    </w:p>
-    <w:p>
-      <w:pPr>
-        <w:jc w:val="center"/>
-      </w:pPr>
-    </w:p>
-    <w:p>
-      <w:pPr>
-        <w:jc w:val="center"/>
-      </w:pPr>
-    </w:p>
-    <w:p>
-      <w:pPr>
-        <w:jc w:val="center"/>
-      </w:pPr>
-    </w:p>
-    <w:p>
-      <w:pPr>
-        <w:jc w:val="center"/>
-      </w:pPr>
-    </w:p>
-    <w:p>
-      <w:pPr>
-        <w:jc w:val="center"/>
-      </w:pPr>
-    </w:p>
-    <w:p>
-      <w:pPr>
-        <w:jc w:val="center"/>
-      </w:pPr>
-    </w:p>
-    <w:p>
-      <w:pPr>
-        <w:jc w:val="center"/>
-      </w:pPr>
-    </w:p>
-    <w:p>
-      <w:pPr>
-        <w:jc w:val="center"/>
-      </w:pPr>
-    </w:p>
-    <w:p>
-      <w:pPr>
-        <w:jc w:val="center"/>
-      </w:pPr>
-    </w:p>
-    <w:p>
-      <w:pPr>
-        <w:jc w:val="center"/>
-      </w:pPr>
-    </w:p>
-    <w:p>
-      <w:pPr>
         <w:pStyle w:val="ListParagraph"/>
         <w:numPr>
           <w:ilvl w:val="0"/>
@@ -601,7 +637,7 @@
                     <pic:cNvPicPr/>
                   </pic:nvPicPr>
                   <pic:blipFill>
-                    <a:blip r:embed="rId12">
+                    <a:blip r:embed="rId13">
                       <a:extLst>
                         <a:ext uri="{28A0092B-C50C-407E-A947-70E740481C1C}">
                           <a14:useLocalDpi xmlns:a14="http://schemas.microsoft.com/office/drawing/2010/main" val="0"/>
@@ -717,9 +753,22 @@
     <w:p/>
     <w:p>
       <w:pPr>
+        <w:rPr>
+          <w:b/>
+          <w:bCs/>
+          <w:color w:val="0000FF"/>
+        </w:rPr>
+      </w:pPr>
+      <w:r>
+        <w:br w:type="page"/>
+      </w:r>
+    </w:p>
+    <w:p>
+      <w:pPr>
         <w:pStyle w:val="Header1-Non-Numbered"/>
       </w:pPr>
       <w:r>
+        <w:lastRenderedPageBreak/>
         <w:t>Requirements</w:t>
       </w:r>
       <w:r>
@@ -976,7 +1025,7 @@
                     <pic:cNvPicPr/>
                   </pic:nvPicPr>
                   <pic:blipFill>
-                    <a:blip r:embed="rId13">
+                    <a:blip r:embed="rId14">
                       <a:extLst>
                         <a:ext uri="{28A0092B-C50C-407E-A947-70E740481C1C}">
                           <a14:useLocalDpi xmlns:a14="http://schemas.microsoft.com/office/drawing/2010/main" val="0"/>
@@ -1531,7 +1580,7 @@
           <w:numId w:val="11"/>
         </w:numPr>
       </w:pPr>
-      <w:hyperlink r:id="rId14" w:history="1">
+      <w:hyperlink r:id="rId15" w:history="1">
         <w:r>
           <w:rPr>
             <w:rStyle w:val="Hyperlink"/>
@@ -1586,7 +1635,7 @@
           <w:numId w:val="11"/>
         </w:numPr>
       </w:pPr>
-      <w:hyperlink r:id="rId15" w:history="1">
+      <w:hyperlink r:id="rId16" w:history="1">
         <w:r>
           <w:rPr>
             <w:rStyle w:val="Hyperlink"/>
@@ -2992,7 +3041,7 @@
                     <pic:cNvPicPr/>
                   </pic:nvPicPr>
                   <pic:blipFill>
-                    <a:blip r:embed="rId16"/>
+                    <a:blip r:embed="rId17"/>
                     <a:stretch>
                       <a:fillRect/>
                     </a:stretch>
@@ -3349,7 +3398,7 @@
                     <pic:cNvPicPr/>
                   </pic:nvPicPr>
                   <pic:blipFill>
-                    <a:blip r:embed="rId17"/>
+                    <a:blip r:embed="rId18"/>
                     <a:stretch>
                       <a:fillRect/>
                     </a:stretch>
@@ -3418,7 +3467,7 @@
       <w:r>
         <w:t xml:space="preserve">the </w:t>
       </w:r>
-      <w:hyperlink r:id="rId18" w:history="1">
+      <w:hyperlink r:id="rId19" w:history="1">
         <w:r>
           <w:rPr>
             <w:rStyle w:val="Hyperlink"/>
@@ -3484,7 +3533,7 @@
                     <pic:cNvPicPr/>
                   </pic:nvPicPr>
                   <pic:blipFill>
-                    <a:blip r:embed="rId19"/>
+                    <a:blip r:embed="rId20"/>
                     <a:stretch>
                       <a:fillRect/>
                     </a:stretch>
@@ -3924,7 +3973,7 @@
                     <pic:cNvPicPr/>
                   </pic:nvPicPr>
                   <pic:blipFill>
-                    <a:blip r:embed="rId20"/>
+                    <a:blip r:embed="rId21"/>
                     <a:stretch>
                       <a:fillRect/>
                     </a:stretch>
@@ -4159,7 +4208,7 @@
           <w:noProof/>
         </w:rPr>
         <w:drawing>
-          <wp:anchor distT="0" distB="0" distL="114300" distR="114300" simplePos="0" relativeHeight="251673600" behindDoc="0" locked="0" layoutInCell="1" allowOverlap="1" wp14:anchorId="60025689" wp14:editId="17A3EFBC">
+          <wp:anchor distT="0" distB="0" distL="114300" distR="114300" simplePos="0" relativeHeight="251673600" behindDoc="0" locked="0" layoutInCell="1" allowOverlap="1" wp14:anchorId="60025689" wp14:editId="2C47F9E2">
             <wp:simplePos x="0" y="0"/>
             <wp:positionH relativeFrom="column">
               <wp:posOffset>913966</wp:posOffset>
@@ -4182,7 +4231,7 @@
                     <pic:cNvPicPr/>
                   </pic:nvPicPr>
                   <pic:blipFill>
-                    <a:blip r:embed="rId21" cstate="print">
+                    <a:blip r:embed="rId22" cstate="print">
                       <a:extLst>
                         <a:ext uri="{28A0092B-C50C-407E-A947-70E740481C1C}">
                           <a14:useLocalDpi xmlns:a14="http://schemas.microsoft.com/office/drawing/2010/main" val="0"/>
@@ -4343,7 +4392,7 @@
                     <pic:cNvPicPr/>
                   </pic:nvPicPr>
                   <pic:blipFill>
-                    <a:blip r:embed="rId22"/>
+                    <a:blip r:embed="rId23"/>
                     <a:stretch>
                       <a:fillRect/>
                     </a:stretch>
@@ -4402,7 +4451,7 @@
                     <pic:cNvPicPr/>
                   </pic:nvPicPr>
                   <pic:blipFill>
-                    <a:blip r:embed="rId23"/>
+                    <a:blip r:embed="rId24"/>
                     <a:stretch>
                       <a:fillRect/>
                     </a:stretch>
@@ -4787,7 +4836,7 @@
                     <pic:cNvPicPr/>
                   </pic:nvPicPr>
                   <pic:blipFill>
-                    <a:blip r:embed="rId24">
+                    <a:blip r:embed="rId10">
                       <a:extLst>
                         <a:ext uri="{28A0092B-C50C-407E-A947-70E740481C1C}">
                           <a14:useLocalDpi xmlns:a14="http://schemas.microsoft.com/office/drawing/2010/main" val="0"/>
@@ -7487,7 +7536,7 @@
           <w:noProof/>
         </w:rPr>
         <w:drawing>
-          <wp:anchor distT="0" distB="0" distL="114300" distR="114300" simplePos="0" relativeHeight="251670528" behindDoc="0" locked="0" layoutInCell="1" allowOverlap="1" wp14:anchorId="3751CB22" wp14:editId="5AC0204C">
+          <wp:anchor distT="0" distB="0" distL="114300" distR="114300" simplePos="0" relativeHeight="251670528" behindDoc="0" locked="0" layoutInCell="1" allowOverlap="1" wp14:anchorId="3751CB22" wp14:editId="41A684F8">
             <wp:simplePos x="0" y="0"/>
             <wp:positionH relativeFrom="column">
               <wp:posOffset>360613</wp:posOffset>
@@ -8507,7 +8556,7 @@
           <w:noProof/>
         </w:rPr>
         <w:drawing>
-          <wp:anchor distT="0" distB="0" distL="114300" distR="114300" simplePos="0" relativeHeight="251671552" behindDoc="0" locked="0" layoutInCell="1" allowOverlap="1" wp14:anchorId="1A5FC5AF" wp14:editId="6FE5B791">
+          <wp:anchor distT="0" distB="0" distL="114300" distR="114300" simplePos="0" relativeHeight="251671552" behindDoc="0" locked="0" layoutInCell="1" allowOverlap="1" wp14:anchorId="1A5FC5AF" wp14:editId="3FEB519B">
             <wp:simplePos x="0" y="0"/>
             <wp:positionH relativeFrom="column">
               <wp:posOffset>-317500</wp:posOffset>
@@ -9744,7 +9793,7 @@
                 <w:noProof/>
               </w:rPr>
               <w:drawing>
-                <wp:inline distT="0" distB="0" distL="0" distR="0" wp14:anchorId="5F738E96" wp14:editId="56FE2BDE">
+                <wp:inline distT="0" distB="0" distL="0" distR="0" wp14:anchorId="5F738E96" wp14:editId="1FC767F1">
                   <wp:extent cx="4716397" cy="902234"/>
                   <wp:effectExtent l="0" t="0" r="0" b="0"/>
                   <wp:docPr id="881595818" name="Picture 1"/>

</xml_diff>

<commit_message>
Updated model guide citation
</commit_message>
<xml_diff>
--- a/ModelGuide/ModelGuide-LakeMeadWaterBank.docx
+++ b/ModelGuide/ModelGuide-LakeMeadWaterBank.docx
@@ -185,7 +185,15 @@
         <w:t>C) Users withdraw and conserve within their available water</w:t>
       </w:r>
       <w:r>
-        <w:t xml:space="preserve">, others choices, and real-time discussion of choices. We see uses of the tool for </w:t>
+        <w:t xml:space="preserve">, </w:t>
+      </w:r>
+      <w:proofErr w:type="gramStart"/>
+      <w:r>
+        <w:t>others</w:t>
+      </w:r>
+      <w:proofErr w:type="gramEnd"/>
+      <w:r>
+        <w:t xml:space="preserve"> choices, and real-time discussion of choices. We see uses of the tool for </w:t>
       </w:r>
       <w:r>
         <w:t>three</w:t>
@@ -3213,7 +3221,15 @@
         <w:t>s on</w:t>
       </w:r>
       <w:r>
-        <w:t xml:space="preserve"> Lake Mead evaporation rates for a five year study for Lake Mead draw down saw variations of 0.25 </w:t>
+        <w:t xml:space="preserve"> Lake Mead evaporation rates for a </w:t>
+      </w:r>
+      <w:proofErr w:type="gramStart"/>
+      <w:r>
+        <w:t>five year</w:t>
+      </w:r>
+      <w:proofErr w:type="gramEnd"/>
+      <w:r>
+        <w:t xml:space="preserve"> study for Lake Mead draw down saw variations of 0.25 </w:t>
       </w:r>
       <w:proofErr w:type="spellStart"/>
       <w:r>
@@ -3830,10 +3846,18 @@
     </w:p>
     <w:p>
       <w:r>
-        <w:t>This storage value is the Reservoir start storage (Cell C19) minus the Protection volume (Cell C20)</w:t>
-      </w:r>
-      <w:r>
-        <w:t>(Figure 1</w:t>
+        <w:t>This storage value is the Reservoir start storage (Cell C19) minus the Protection volume (Cell C</w:t>
+      </w:r>
+      <w:proofErr w:type="gramStart"/>
+      <w:r>
+        <w:t>20)</w:t>
+      </w:r>
+      <w:r>
+        <w:t>(</w:t>
+      </w:r>
+      <w:proofErr w:type="gramEnd"/>
+      <w:r>
+        <w:t>Figure 1</w:t>
       </w:r>
       <w:r>
         <w:t>a</w:t>
@@ -4188,7 +4212,15 @@
         <w:t xml:space="preserve">Tribal </w:t>
       </w:r>
       <w:r>
-        <w:t>Nations in the Lower Basin that are located in California (</w:t>
+        <w:t xml:space="preserve">Nations in the Lower Basin that </w:t>
+      </w:r>
+      <w:proofErr w:type="gramStart"/>
+      <w:r>
+        <w:t>are located in</w:t>
+      </w:r>
+      <w:proofErr w:type="gramEnd"/>
+      <w:r>
+        <w:t xml:space="preserve"> California (</w:t>
       </w:r>
       <w:r>
         <w:t xml:space="preserve">Figure 1c). </w:t>
@@ -4200,7 +4232,7 @@
           <w:noProof/>
         </w:rPr>
         <w:drawing>
-          <wp:anchor distT="0" distB="0" distL="114300" distR="114300" simplePos="0" relativeHeight="251673600" behindDoc="0" locked="0" layoutInCell="1" allowOverlap="1" wp14:anchorId="60025689" wp14:editId="232A3A77">
+          <wp:anchor distT="0" distB="0" distL="114300" distR="114300" simplePos="0" relativeHeight="251673600" behindDoc="0" locked="0" layoutInCell="1" allowOverlap="1" wp14:anchorId="60025689" wp14:editId="7E8F0919">
             <wp:simplePos x="0" y="0"/>
             <wp:positionH relativeFrom="column">
               <wp:posOffset>913966</wp:posOffset>
@@ -4539,7 +4571,21 @@
         <w:rPr>
           <w:rStyle w:val="Heading3Char"/>
         </w:rPr>
-        <w:t xml:space="preserve">This cell specifies the percent of settled water rights for Tribal Nations of the Lower Basin that are located in Arizona (see also </w:t>
+        <w:t xml:space="preserve">This cell specifies the percent of settled water rights for Tribal Nations of the Lower Basin that </w:t>
+      </w:r>
+      <w:proofErr w:type="gramStart"/>
+      <w:r>
+        <w:rPr>
+          <w:rStyle w:val="Heading3Char"/>
+        </w:rPr>
+        <w:t>are located in</w:t>
+      </w:r>
+      <w:proofErr w:type="gramEnd"/>
+      <w:r>
+        <w:rPr>
+          <w:rStyle w:val="Heading3Char"/>
+        </w:rPr>
+        <w:t xml:space="preserve"> Arizona (see also </w:t>
       </w:r>
       <w:r>
         <w:rPr>
@@ -5992,6 +6038,7 @@
       <w:r>
         <w:t xml:space="preserve"> When using existing Water Conservation Account balances, users can access </w:t>
       </w:r>
+      <w:proofErr w:type="gramStart"/>
       <w:r>
         <w:rPr>
           <w:b/>
@@ -6002,6 +6049,7 @@
       <w:r>
         <w:t xml:space="preserve"> of</w:t>
       </w:r>
+      <w:proofErr w:type="gramEnd"/>
       <w:r>
         <w:t xml:space="preserve"> the prior conserved water </w:t>
       </w:r>
@@ -7316,11 +7364,16 @@
         <w:t xml:space="preserve"> of total shortage</w:t>
       </w:r>
       <w:r>
-        <w:t xml:space="preserve"> (Table 4b, Rows [3] and [8]) </w:t>
+        <w:t xml:space="preserve"> (Table 4b, Rows [3] and [8]</w:t>
+      </w:r>
+      <w:proofErr w:type="gramStart"/>
+      <w:r>
+        <w:t xml:space="preserve">) </w:t>
       </w:r>
       <w:r>
         <w:t>.</w:t>
       </w:r>
+      <w:proofErr w:type="gramEnd"/>
     </w:p>
     <w:p>
       <w:pPr>
@@ -7452,7 +7505,15 @@
         </w:drawing>
       </w:r>
       <w:r>
-        <w:t>Finally, we calculate each users percentage share of the inflow as their volume (Table 4a, Columns [</w:t>
+        <w:t xml:space="preserve">Finally, we calculate each </w:t>
+      </w:r>
+      <w:proofErr w:type="gramStart"/>
+      <w:r>
+        <w:t>users</w:t>
+      </w:r>
+      <w:proofErr w:type="gramEnd"/>
+      <w:r>
+        <w:t xml:space="preserve"> percentage share of the inflow as their volume (Table 4a, Columns [</w:t>
       </w:r>
       <w:r>
         <w:t>H</w:t>
@@ -7499,7 +7560,7 @@
           <w:noProof/>
         </w:rPr>
         <w:drawing>
-          <wp:anchor distT="0" distB="0" distL="114300" distR="114300" simplePos="0" relativeHeight="251670528" behindDoc="0" locked="0" layoutInCell="1" allowOverlap="1" wp14:anchorId="3751CB22" wp14:editId="37BB2FEC">
+          <wp:anchor distT="0" distB="0" distL="114300" distR="114300" simplePos="0" relativeHeight="251670528" behindDoc="0" locked="0" layoutInCell="1" allowOverlap="1" wp14:anchorId="3751CB22" wp14:editId="4C1FE488">
             <wp:simplePos x="0" y="0"/>
             <wp:positionH relativeFrom="column">
               <wp:posOffset>360613</wp:posOffset>
@@ -7822,10 +7883,18 @@
         <w:t>Arizona’s Historical Allocation</w:t>
       </w:r>
       <w:r>
-        <w:t xml:space="preserve"> – </w:t>
-      </w:r>
-      <w:r>
-        <w:t xml:space="preserve"> Arizona’s percent of the Tribal Nations</w:t>
+        <w:t xml:space="preserve"> </w:t>
+      </w:r>
+      <w:proofErr w:type="gramStart"/>
+      <w:r>
+        <w:t xml:space="preserve">– </w:t>
+      </w:r>
+      <w:r>
+        <w:t xml:space="preserve"> Arizona’s</w:t>
+      </w:r>
+      <w:proofErr w:type="gramEnd"/>
+      <w:r>
+        <w:t xml:space="preserve"> percent of the Tribal Nations</w:t>
       </w:r>
       <w:r>
         <w:t xml:space="preserve"> (from Figure 4a)</w:t>
@@ -7920,8 +7989,13 @@
         <w:t>3</w:t>
       </w:r>
       <w:r>
-        <w:t xml:space="preserve"> –  0.013</w:t>
-      </w:r>
+        <w:t xml:space="preserve"> </w:t>
+      </w:r>
+      <w:proofErr w:type="gramStart"/>
+      <w:r>
+        <w:t>–  0.013</w:t>
+      </w:r>
+      <w:proofErr w:type="gramEnd"/>
       <w:r>
         <w:t xml:space="preserve"> * 0.94 </w:t>
       </w:r>
@@ -8130,10 +8204,18 @@
         <w:t>[G]</w:t>
       </w:r>
       <w:r>
-        <w:t xml:space="preserve"> / Lake Mead full inflow [B].</w:t>
-      </w:r>
-      <w:r>
-        <w:t>Total Percentage of Reservoir Inflow [L] = [H] + [I] + [J] + [K] + [T] = 100%.</w:t>
+        <w:t xml:space="preserve"> / Lake Mead full inflow [B</w:t>
+      </w:r>
+      <w:proofErr w:type="gramStart"/>
+      <w:r>
+        <w:t>].</w:t>
+      </w:r>
+      <w:r>
+        <w:t>Total</w:t>
+      </w:r>
+      <w:proofErr w:type="gramEnd"/>
+      <w:r>
+        <w:t xml:space="preserve"> Percentage of Reservoir Inflow [L] = [H] + [I] + [J] + [K] + [T] = 100%.</w:t>
       </w:r>
     </w:p>
     <w:p>
@@ -8242,7 +8324,15 @@
         </w:numPr>
       </w:pPr>
       <w:r>
-        <w:t>Mexico is not influenced by the inclusion of the Tribal Nations in the Share of Lake Mead Inflow Allocation. This is because none of the Tribal Nations water is stored in Mexico.</w:t>
+        <w:t xml:space="preserve">Mexico is not influenced by the inclusion of the Tribal Nations in the Share of Lake Mead Inflow Allocation. This is because none of the Tribal </w:t>
+      </w:r>
+      <w:proofErr w:type="gramStart"/>
+      <w:r>
+        <w:t>Nations</w:t>
+      </w:r>
+      <w:proofErr w:type="gramEnd"/>
+      <w:r>
+        <w:t xml:space="preserve"> water is stored in Mexico.</w:t>
       </w:r>
     </w:p>
     <w:p>
@@ -8490,7 +8580,7 @@
           <w:noProof/>
         </w:rPr>
         <w:drawing>
-          <wp:anchor distT="0" distB="0" distL="114300" distR="114300" simplePos="0" relativeHeight="251671552" behindDoc="0" locked="0" layoutInCell="1" allowOverlap="1" wp14:anchorId="1A5FC5AF" wp14:editId="5B3FC025">
+          <wp:anchor distT="0" distB="0" distL="114300" distR="114300" simplePos="0" relativeHeight="251671552" behindDoc="0" locked="0" layoutInCell="1" allowOverlap="1" wp14:anchorId="1A5FC5AF" wp14:editId="65717199">
             <wp:simplePos x="0" y="0"/>
             <wp:positionH relativeFrom="column">
               <wp:posOffset>-317500</wp:posOffset>
@@ -8804,7 +8894,23 @@
           <w:b/>
           <w:bCs/>
         </w:rPr>
-        <w:t xml:space="preserve"> So the ending balance is also 4.8 </w:t>
+        <w:t xml:space="preserve"> </w:t>
+      </w:r>
+      <w:proofErr w:type="gramStart"/>
+      <w:r>
+        <w:rPr>
+          <w:b/>
+          <w:bCs/>
+        </w:rPr>
+        <w:t>So</w:t>
+      </w:r>
+      <w:proofErr w:type="gramEnd"/>
+      <w:r>
+        <w:rPr>
+          <w:b/>
+          <w:bCs/>
+        </w:rPr>
+        <w:t xml:space="preserve"> the ending balance is also 4.8 </w:t>
       </w:r>
       <w:proofErr w:type="spellStart"/>
       <w:r>
@@ -9523,7 +9629,15 @@
       </w:r>
       <w:proofErr w:type="spellEnd"/>
       <w:r>
-        <w:t xml:space="preserve"> at $500 per acre-foot is (0.5)(500) = $250 million.</w:t>
+        <w:t xml:space="preserve"> at $500 per acre-foot is (</w:t>
+      </w:r>
+      <w:proofErr w:type="gramStart"/>
+      <w:r>
+        <w:t>0.5)(</w:t>
+      </w:r>
+      <w:proofErr w:type="gramEnd"/>
+      <w:r>
+        <w:t>500) = $250 million.</w:t>
       </w:r>
     </w:p>
     <w:p>
@@ -9577,7 +9691,15 @@
         <w:jc w:val="center"/>
       </w:pPr>
       <w:r>
-        <w:t>Compensation = (0.5)(500) + (0.2)(1,200) = $850 million.</w:t>
+        <w:t>Compensation = (</w:t>
+      </w:r>
+      <w:proofErr w:type="gramStart"/>
+      <w:r>
+        <w:t>0.5)(</w:t>
+      </w:r>
+      <w:proofErr w:type="gramEnd"/>
+      <w:r>
+        <w:t>500) + (0.2)(1,200) = $850 million.</w:t>
       </w:r>
     </w:p>
     <w:p>
@@ -9695,7 +9817,7 @@
                 <w:noProof/>
               </w:rPr>
               <w:drawing>
-                <wp:inline distT="0" distB="0" distL="0" distR="0" wp14:anchorId="5F738E96" wp14:editId="1034F8F6">
+                <wp:inline distT="0" distB="0" distL="0" distR="0" wp14:anchorId="5F738E96" wp14:editId="51DEA51F">
                   <wp:extent cx="4716397" cy="902234"/>
                   <wp:effectExtent l="0" t="0" r="0" b="0"/>
                   <wp:docPr id="881595818" name="Picture 1"/>
@@ -9888,7 +10010,15 @@
         <w:fldChar w:fldCharType="end"/>
       </w:r>
       <w:r>
-        <w:t xml:space="preserve">. These withdrawals include to Tribal Nations within each state . </w:t>
+        <w:t xml:space="preserve">. These withdrawals include to Tribal Nations within each </w:t>
+      </w:r>
+      <w:proofErr w:type="gramStart"/>
+      <w:r>
+        <w:t>state .</w:t>
+      </w:r>
+      <w:proofErr w:type="gramEnd"/>
+      <w:r>
+        <w:t xml:space="preserve"> </w:t>
       </w:r>
       <w:r>
         <w:t xml:space="preserve">Tribal Nations of the Lower Basin have recently consumed about 460,000 of their 0.95 million </w:t>
@@ -10307,16 +10437,8 @@
       <w:r>
         <w:t xml:space="preserve"> </w:t>
       </w:r>
-      <w:hyperlink r:id="rId39" w:history="1">
-        <w:r>
-          <w:rPr>
-            <w:rStyle w:val="Hyperlink"/>
-          </w:rPr>
-          <w:t>https://github.com/dzeke/ColoradoRiverCollaborate/tree/main/LakeMeadWaterBankDivideInflow</w:t>
-        </w:r>
-      </w:hyperlink>
-      <w:r>
-        <w:t>.</w:t>
+      <w:r>
+        <w:t>https://github.com/ImmersiveModelsColoradoRiver/LakeMeadDivideInflow</w:t>
       </w:r>
     </w:p>
     <w:p>
@@ -10354,7 +10476,7 @@
       <w:pPr>
         <w:spacing w:after="0" w:line="240" w:lineRule="auto"/>
       </w:pPr>
-      <w:hyperlink r:id="rId40" w:history="1">
+      <w:hyperlink r:id="rId39" w:history="1">
         <w:r>
           <w:rPr>
             <w:rStyle w:val="Hyperlink"/>
@@ -10415,7 +10537,7 @@
           <w:bCs/>
         </w:rPr>
       </w:pPr>
-      <w:hyperlink r:id="rId41" w:history="1">
+      <w:hyperlink r:id="rId40" w:history="1">
         <w:r>
           <w:rPr>
             <w:rStyle w:val="Hyperlink"/>
@@ -10523,7 +10645,7 @@
         </w:rPr>
         <w:t xml:space="preserve">  </w:t>
       </w:r>
-      <w:hyperlink r:id="rId42" w:history="1">
+      <w:hyperlink r:id="rId41" w:history="1">
         <w:r>
           <w:rPr>
             <w:rStyle w:val="Hyperlink"/>
@@ -10622,7 +10744,7 @@
         </w:rPr>
         <w:t xml:space="preserve"> (Section 3); Equalize storage in Lake Powell and Lake Mead (Section 6). </w:t>
       </w:r>
-      <w:hyperlink r:id="rId43" w:history="1">
+      <w:hyperlink r:id="rId42" w:history="1">
         <w:r>
           <w:rPr>
             <w:rFonts w:ascii="Times New Roman" w:hAnsi="Times New Roman"/>
@@ -10710,7 +10832,7 @@
         </w:rPr>
         <w:t xml:space="preserve"> mandatory conservation as Lake Mead’s level falls from 1,090 to 1,025 feet. </w:t>
       </w:r>
-      <w:hyperlink r:id="rId44" w:history="1">
+      <w:hyperlink r:id="rId43" w:history="1">
         <w:r>
           <w:rPr>
             <w:rFonts w:ascii="Times New Roman" w:hAnsi="Times New Roman"/>
@@ -10990,7 +11112,7 @@
         </w:rPr>
         <w:t xml:space="preserve">. Protect Lake Mead from falling below elevation 1,020 feet. </w:t>
       </w:r>
-      <w:hyperlink r:id="rId45" w:history="1">
+      <w:hyperlink r:id="rId44" w:history="1">
         <w:r>
           <w:rPr>
             <w:rStyle w:val="Hyperlink"/>
@@ -11478,7 +11600,7 @@
       <w:r>
         <w:t xml:space="preserve">, November 8, 2021. </w:t>
       </w:r>
-      <w:hyperlink r:id="rId46" w:history="1">
+      <w:hyperlink r:id="rId45" w:history="1">
         <w:r>
           <w:rPr>
             <w:rStyle w:val="Hyperlink"/>
@@ -11499,7 +11621,7 @@
       <w:r>
         <w:t xml:space="preserve">Buschatzke, T., Hamby, J. B., and Entsminger, J. (2024). "Lower Basin Alternative for the Post-2026 Coordinated Operation of the Colorado River Basin." </w:t>
       </w:r>
-      <w:hyperlink r:id="rId47" w:history="1">
+      <w:hyperlink r:id="rId46" w:history="1">
         <w:r>
           <w:rPr>
             <w:rStyle w:val="Hyperlink"/>
@@ -11529,7 +11651,7 @@
       <w:r>
         <w:t xml:space="preserve">. </w:t>
       </w:r>
-      <w:hyperlink r:id="rId48" w:history="1">
+      <w:hyperlink r:id="rId47" w:history="1">
         <w:r>
           <w:rPr>
             <w:rStyle w:val="Hyperlink"/>
@@ -11550,7 +11672,7 @@
       <w:r>
         <w:t xml:space="preserve">Colorado River Compact. (1922). </w:t>
       </w:r>
-      <w:hyperlink r:id="rId49" w:history="1">
+      <w:hyperlink r:id="rId48" w:history="1">
         <w:r>
           <w:rPr>
             <w:rStyle w:val="Hyperlink"/>
@@ -11571,7 +11693,7 @@
       <w:r>
         <w:t xml:space="preserve">IBWC. (2021). "Minutes between the United States and Mexican Sections of the IBWC." United States Section, </w:t>
       </w:r>
-      <w:hyperlink r:id="rId50" w:history="1">
+      <w:hyperlink r:id="rId49" w:history="1">
         <w:r>
           <w:rPr>
             <w:rStyle w:val="Hyperlink"/>
@@ -11601,7 +11723,7 @@
       <w:r>
         <w:t xml:space="preserve">. </w:t>
       </w:r>
-      <w:hyperlink r:id="rId51" w:history="1">
+      <w:hyperlink r:id="rId50" w:history="1">
         <w:r>
           <w:rPr>
             <w:rStyle w:val="Hyperlink"/>
@@ -11641,7 +11763,7 @@
       <w:r>
         <w:t xml:space="preserve">Moreo, M. T. (2015). "Evaporation data from Lake Mead and Lake Mohave, Nevada and Arizona, March 2010 through April 2015." U.S. Geological Survey Data Release. </w:t>
       </w:r>
-      <w:hyperlink r:id="rId52" w:history="1">
+      <w:hyperlink r:id="rId51" w:history="1">
         <w:r>
           <w:rPr>
             <w:rStyle w:val="Hyperlink"/>
@@ -11671,7 +11793,7 @@
       <w:r>
         <w:t xml:space="preserve">, 3. </w:t>
       </w:r>
-      <w:hyperlink r:id="rId53" w:history="1">
+      <w:hyperlink r:id="rId52" w:history="1">
         <w:r>
           <w:rPr>
             <w:rStyle w:val="Hyperlink"/>
@@ -11701,7 +11823,7 @@
       <w:r>
         <w:t xml:space="preserve">, 60(7), e2024WR037225. </w:t>
       </w:r>
-      <w:hyperlink r:id="rId54" w:history="1">
+      <w:hyperlink r:id="rId53" w:history="1">
         <w:r>
           <w:rPr>
             <w:rStyle w:val="Hyperlink"/>
@@ -11722,7 +11844,7 @@
       <w:r>
         <w:t xml:space="preserve">Schmidt, J. C., Kraft, M., Tuzlak, D., and Walker, A. (2016). "Fill Mead First: a technical assessment." Utah State University, Logan, Utah. </w:t>
       </w:r>
-      <w:hyperlink r:id="rId55" w:history="1">
+      <w:hyperlink r:id="rId54" w:history="1">
         <w:r>
           <w:rPr>
             <w:rStyle w:val="Hyperlink"/>
@@ -11743,7 +11865,7 @@
       <w:r>
         <w:t xml:space="preserve">Ten Tribes Partnership. (2018). "Colorado River Basin  Ten Tribes Partnership Tribal Water Study." U.S. Department of the Interior, Bureau of Reclamation, Ten Tribes Partnership. </w:t>
       </w:r>
-      <w:hyperlink r:id="rId56" w:history="1">
+      <w:hyperlink r:id="rId55" w:history="1">
         <w:r>
           <w:rPr>
             <w:rStyle w:val="Hyperlink"/>
@@ -11773,7 +11895,7 @@
       <w:r>
         <w:t xml:space="preserve">. </w:t>
       </w:r>
-      <w:hyperlink r:id="rId57" w:history="1">
+      <w:hyperlink r:id="rId56" w:history="1">
         <w:r>
           <w:rPr>
             <w:rStyle w:val="Hyperlink"/>
@@ -11803,7 +11925,7 @@
       <w:r>
         <w:t xml:space="preserve">. </w:t>
       </w:r>
-      <w:hyperlink r:id="rId58" w:history="1">
+      <w:hyperlink r:id="rId57" w:history="1">
         <w:r>
           <w:rPr>
             <w:rStyle w:val="Hyperlink"/>
@@ -11824,7 +11946,7 @@
       <w:r>
         <w:t xml:space="preserve">USBR. (2012). "Colorado River Basin Water Supply and Demand Study." U.S. Department of Interior, Bureau of Reclamation, Washington, D.C., </w:t>
       </w:r>
-      <w:hyperlink r:id="rId59" w:history="1">
+      <w:hyperlink r:id="rId58" w:history="1">
         <w:r>
           <w:rPr>
             <w:rStyle w:val="Hyperlink"/>
@@ -11846,7 +11968,7 @@
         <w:lastRenderedPageBreak/>
         <w:t xml:space="preserve">USBR. (2019). "Agreement Concerning Colorado River Drought Contingency Management and Operations." U.S. Bureau of Reclamation, Washington, DC. </w:t>
       </w:r>
-      <w:hyperlink r:id="rId60" w:history="1">
+      <w:hyperlink r:id="rId59" w:history="1">
         <w:r>
           <w:rPr>
             <w:rStyle w:val="Hyperlink"/>
@@ -11867,7 +11989,7 @@
       <w:r>
         <w:t xml:space="preserve">USBR. (2020). "Review of the Colorado River Interim Guidelines for Lower Basin Shortages and Coordinated Operations for Lake Powell and Lake Mead." U.S. Bureau of Reclamation, U.S. Department of Interior. </w:t>
       </w:r>
-      <w:hyperlink r:id="rId61" w:history="1">
+      <w:hyperlink r:id="rId60" w:history="1">
         <w:r>
           <w:rPr>
             <w:rStyle w:val="Hyperlink"/>
@@ -11888,7 +12010,7 @@
       <w:r>
         <w:t xml:space="preserve">USBR. (2021a). "Boulder Canyon Operations Office - Program and Activities: Water Accounting Reports." U.S. Bureau of Reclamation. </w:t>
       </w:r>
-      <w:hyperlink r:id="rId62" w:history="1">
+      <w:hyperlink r:id="rId61" w:history="1">
         <w:r>
           <w:rPr>
             <w:rStyle w:val="Hyperlink"/>
@@ -11909,7 +12031,7 @@
       <w:r>
         <w:t xml:space="preserve">USBR. (2021b). "Lake Mead at Hoover Dam, End of Month Elevation." Lower Colorado River Operations, U.S. Buruea of Reclamation, </w:t>
       </w:r>
-      <w:hyperlink r:id="rId63" w:history="1">
+      <w:hyperlink r:id="rId62" w:history="1">
         <w:r>
           <w:rPr>
             <w:rStyle w:val="Hyperlink"/>
@@ -11930,7 +12052,7 @@
       <w:r>
         <w:t xml:space="preserve">USBR. (2021c). "Pilot System Conservation Program." U.S. Bureau of Reclamation, </w:t>
       </w:r>
-      <w:hyperlink r:id="rId64" w:history="1">
+      <w:hyperlink r:id="rId63" w:history="1">
         <w:r>
           <w:rPr>
             <w:rStyle w:val="Hyperlink"/>
@@ -11951,7 +12073,7 @@
       <w:r>
         <w:t xml:space="preserve">USBR. (2023a). "Integrated Technical Education Workgroup." U.S. Bureau of Reclamation, </w:t>
       </w:r>
-      <w:hyperlink r:id="rId65" w:history="1">
+      <w:hyperlink r:id="rId64" w:history="1">
         <w:r>
           <w:rPr>
             <w:rStyle w:val="Hyperlink"/>
@@ -11972,7 +12094,7 @@
       <w:r>
         <w:t xml:space="preserve">USBR. (2023b). "Post-2026 Colorado River Reservoir Operational Strategies for Lake Powell and Lake Mead: Summary of the Federal Register Notice Input Received." Reclamation, </w:t>
       </w:r>
-      <w:hyperlink r:id="rId66" w:history="1">
+      <w:hyperlink r:id="rId65" w:history="1">
         <w:r>
           <w:rPr>
             <w:rStyle w:val="Hyperlink"/>
@@ -11993,7 +12115,7 @@
       <w:r>
         <w:t xml:space="preserve">USGS. (2016). "Colorado River Basin map." U.S. Geological Survey. </w:t>
       </w:r>
-      <w:hyperlink r:id="rId67" w:history="1">
+      <w:hyperlink r:id="rId66" w:history="1">
         <w:r>
           <w:rPr>
             <w:rStyle w:val="Hyperlink"/>
@@ -12014,7 +12136,7 @@
       <w:r>
         <w:t xml:space="preserve">Wheeler, K. G., Schmidt, J. C., and Rosenberg, D. E. (2019). "Water Resource Modelling of the Colorado River – Present and Future Strategies." Center for Colorado River Studies, Utah State University, Logan, Utah. </w:t>
       </w:r>
-      <w:hyperlink r:id="rId68" w:history="1">
+      <w:hyperlink r:id="rId67" w:history="1">
         <w:r>
           <w:rPr>
             <w:rStyle w:val="Hyperlink"/>
@@ -12043,7 +12165,7 @@
       <w:r>
         <w:t xml:space="preserve">, 37(4), 913-929. </w:t>
       </w:r>
-      <w:hyperlink r:id="rId69" w:history="1">
+      <w:hyperlink r:id="rId68" w:history="1">
         <w:r>
           <w:rPr>
             <w:rStyle w:val="Hyperlink"/>
@@ -12069,8 +12191,8 @@
       </w:r>
     </w:p>
     <w:sectPr>
-      <w:headerReference w:type="default" r:id="rId70"/>
-      <w:footerReference w:type="default" r:id="rId71"/>
+      <w:headerReference w:type="default" r:id="rId69"/>
+      <w:footerReference w:type="default" r:id="rId70"/>
       <w:pgSz w:w="12240" w:h="15840"/>
       <w:pgMar w:top="1440" w:right="1440" w:bottom="1440" w:left="1440" w:header="720" w:footer="720" w:gutter="0"/>
       <w:cols w:space="720"/>

</xml_diff>